<commit_message>
docs(sonha): ra soat huong dan OKR/KPI khop 100% cach danh gia phan mem
- Bo hoan toan "gio cong" (phan mem khong dung): bang N1-N5 chi con Diem quy doi (chuan 100).
- Sua trung ten: danh muc goi "Phan I/II/III (CMNV/LDQL/HTPV)", tach khoi "Nhom I(30)/Nhom II(70)".
- Khop code: N2 = 110-120 (he so 1,1-1,2); Dieu 8 muc HT ha do "Khong hoan thanh (<50%)";
  Nhom I liet ke 5 nhom tieu chi QD 1053; vi du xep loai theo dung dieu kien dinh luong.
- Xac minh khop: 48 muc danh muc, 3 tieu chi (a+b+c)/3, suy muc do, trong so, Nhom II=KPI*70%,
  thuong vuot muc, lanh dao khong dung d/d/e.

Co-Authored-By: Claude Opus 4.8 (1M context) <noreply@anthropic.com>
</commit_message>
<xml_diff>
--- a/Huong-dan-OKR-KPI-lap-danh-muc-danh-gia.docx
+++ b/Huong-dan-OKR-KPI-lap-danh-muc-danh-gia.docx
@@ -192,7 +192,7 @@
           <w:sz w:val="26"/>
           <w:szCs w:val="26"/>
         </w:rPr>
-        <w:t xml:space="preserve">Lập danh mục sản phẩm/công việc, xác định đơn vị sản phẩm/công việc chuẩn và hệ số quy đổi; phương pháp đánh giá kết quả thực hiện nhiệm vụ gắn với đo lường hiệu suất công việc (OKR/KPI)</w:t>
+        <w:t xml:space="preserve">Lập danh mục sản phẩm/công việc, xác định hệ số quy đổi và đánh giá kết quả thực hiện nhiệm vụ gắn với đo lường hiệu suất công việc (OKR/KPI)</w:t>
       </w:r>
     </w:p>
     <w:p>
@@ -296,7 +296,7 @@
           <w:sz w:val="26"/>
           <w:szCs w:val="26"/>
         </w:rPr>
-        <w:t xml:space="preserve">Ban Tổ chức Tỉnh ủy hướng dẫn các cơ quan, đơn vị trong hệ thống chính trị thực hiện việc lập danh mục sản phẩm/công việc và đánh giá kết quả thực hiện nhiệm vụ gắn với OKR/KPI như sau (danh mục và cách chấm minh họa được trích từ hệ thống phần mềm đã triển khai tại Văn phòng Đoàn ĐBQH và HĐND tỉnh):</w:t>
+        <w:t xml:space="preserve">Ban Tổ chức Tỉnh ủy hướng dẫn các cơ quan, đơn vị trong hệ thống chính trị thực hiện việc lập danh mục sản phẩm/công việc và đánh giá kết quả thực hiện nhiệm vụ gắn với OKR/KPI trên phần mềm như sau (danh mục và cách chấm minh họa được trích từ hệ thống phần mềm đã triển khai tại Văn phòng Đoàn ĐBQH và HĐND tỉnh):</w:t>
       </w:r>
     </w:p>
     <w:p>
@@ -344,7 +344,7 @@
           <w:sz w:val="26"/>
           <w:szCs w:val="26"/>
         </w:rPr>
-        <w:t xml:space="preserve">Hướng dẫn thống nhất phương pháp lập danh mục sản phẩm/công việc; xác định đơn vị sản phẩm/công việc chuẩn; xác định hệ số quy đổi (điểm quy đổi) và cách chấm điểm số lượng, chất lượng, tiến độ để phục vụ giao nhiệm vụ, theo dõi, đánh giá, xếp loại cán bộ, công chức hằng tháng/quý/năm.</w:t>
+        <w:t xml:space="preserve">Hướng dẫn thống nhất phương pháp lập danh mục sản phẩm/công việc; xác định đơn vị sản phẩm/công việc chuẩn và hệ số quy đổi theo mức độ phức tạp; cách chấm điểm số lượng, chất lượng, tiến độ để phục vụ giao nhiệm vụ, theo dõi, đánh giá, xếp loại cán bộ, công chức hằng tháng/quý/năm trên phần mềm.</w:t>
       </w:r>
     </w:p>
     <w:p>
@@ -502,7 +502,7 @@
           <w:sz w:val="26"/>
           <w:szCs w:val="26"/>
         </w:rPr>
-        <w:t xml:space="preserve">Hướng dẫn này là tài liệu để các cơ quan, đơn vị trong hệ thống chính trị của tỉnh xây dựng danh mục sản phẩm/công việc và triển khai đánh giá theo OKR/KPI phù hợp đặc thù của từng khối, từng lĩnh vực, từng vị trí việc làm; danh mục và ví dụ chấm điểm nêu tại Hướng dẫn có tính minh họa để tham khảo, vận dụng.</w:t>
+        <w:t xml:space="preserve">Hướng dẫn này để các cơ quan, đơn vị trong hệ thống chính trị của tỉnh xây dựng danh mục sản phẩm/công việc và triển khai đánh giá theo OKR/KPI trên phần mềm, phù hợp đặc thù của từng khối, từng lĩnh vực, từng vị trí việc làm; danh mục và ví dụ chấm điểm nêu tại Hướng dẫn có tính minh họa để tham khảo, vận dụng.</w:t>
       </w:r>
     </w:p>
     <w:p>
@@ -592,7 +592,7 @@
           <w:sz w:val="26"/>
           <w:szCs w:val="26"/>
         </w:rPr>
-        <w:t xml:space="preserve">một sản phẩm thường xuyên, phổ biến, đầu ra rõ, được chọn làm thước đo chung. Ví dụ minh họa lấy "Soạn thảo 01 văn bản hành chính thông thường" làm chuẩn.</w:t>
+        <w:t xml:space="preserve">một sản phẩm thường xuyên, phổ biến, đầu ra rõ, được chọn làm thước đo chung. Phần mềm lấy "Soạn thảo 01 văn bản hành chính thông thường" làm chuẩn = 100 điểm = hệ số 1,0.</w:t>
       </w:r>
     </w:p>
     <w:p>
@@ -609,7 +609,7 @@
           <w:sz w:val="26"/>
           <w:szCs w:val="26"/>
         </w:rPr>
-        <w:t xml:space="preserve">4. Giờ công chuẩn: </w:t>
+        <w:t xml:space="preserve">4. Điểm quy đổi (hệ số): </w:t>
       </w:r>
       <w:r>
         <w:rPr>
@@ -617,7 +617,7 @@
           <w:sz w:val="26"/>
           <w:szCs w:val="26"/>
         </w:rPr>
-        <w:t xml:space="preserve">thời gian lao động cần thiết trong điều kiện bình thường để hoàn thành 01 đơn vị sản phẩm đạt yêu cầu; thống nhất 01 ngày công = 08 giờ.</w:t>
+        <w:t xml:space="preserve">điểm phản ánh mức độ phức tạp, công sức của mỗi sản phẩm so với sản phẩm chuẩn, do tổ chuyên gia/nhóm cán bộ am hiểu nghiệp vụ xác định theo nhóm N1–N5. Hệ số = Điểm quy đổi ÷ 100; dùng làm TRỌNG SỐ khi giao việc và tổng hợp KPI. Phần mềm KHÔNG dùng đơn vị giờ công.</w:t>
       </w:r>
     </w:p>
     <w:p>
@@ -634,32 +634,7 @@
           <w:sz w:val="26"/>
           <w:szCs w:val="26"/>
         </w:rPr>
-        <w:t xml:space="preserve">5. Hệ số quy đổi (điểm quy đổi): </w:t>
-      </w:r>
-      <w:r>
-        <w:rPr>
-          <w:rFonts w:ascii="Times New Roman" w:cs="Times New Roman" w:eastAsia="Times New Roman" w:hAnsi="Times New Roman"/>
-          <w:sz w:val="26"/>
-          <w:szCs w:val="26"/>
-        </w:rPr>
-        <w:t xml:space="preserve">tỷ lệ giữa giờ công chuẩn (hoặc điểm) của mỗi sản phẩm so với sản phẩm chuẩn; dùng làm TRỌNG SỐ khi giao việc và tổng hợp KPI.</w:t>
-      </w:r>
-    </w:p>
-    <w:p>
-      <w:pPr>
-        <w:spacing w:after="60" w:line="300"/>
-        <w:ind w:firstLine="480"/>
-        <w:jc w:val="both"/>
-      </w:pPr>
-      <w:r>
-        <w:rPr>
-          <w:rFonts w:ascii="Times New Roman" w:cs="Times New Roman" w:eastAsia="Times New Roman" w:hAnsi="Times New Roman"/>
-          <w:b/>
-          <w:bCs/>
-          <w:sz w:val="26"/>
-          <w:szCs w:val="26"/>
-        </w:rPr>
-        <w:t xml:space="preserve">6. Tầm quan trọng: </w:t>
+        <w:t xml:space="preserve">5. Tầm quan trọng: </w:t>
       </w:r>
       <w:r>
         <w:rPr>
@@ -684,7 +659,7 @@
           <w:sz w:val="26"/>
           <w:szCs w:val="26"/>
         </w:rPr>
-        <w:t xml:space="preserve">7. Kết quả nhiệm vụ: </w:t>
+        <w:t xml:space="preserve">6. Kết quả nhiệm vụ: </w:t>
       </w:r>
       <w:r>
         <w:rPr>
@@ -993,7 +968,7 @@
                 <w:sz w:val="22"/>
                 <w:szCs w:val="22"/>
               </w:rPr>
-              <w:t xml:space="preserve">Thống kê nhiệm vụ, sản phẩm đầu ra (Phụ lục I); đối chiếu với danh mục dựng sẵn theo Mẫu (chức vụ); bổ sung mục còn thiếu.</w:t>
+              <w:t xml:space="preserve">Thống kê nhiệm vụ, sản phẩm đầu ra (Phụ lục I); đối chiếu với danh mục dựng sẵn theo Mẫu (chức vụ); đề xuất bổ sung nhiệm vụ/sản phẩm còn thiếu để cập nhật danh mục.</w:t>
             </w:r>
           </w:p>
         </w:tc>
@@ -1045,32 +1020,32 @@
                 <w:sz w:val="22"/>
                 <w:szCs w:val="22"/>
               </w:rPr>
-              <w:t xml:space="preserve">Phân nhóm N1–N5, xác định hệ số</w:t>
-            </w:r>
-          </w:p>
-        </w:tc>
-        <w:tc>
-          <w:tcPr>
-            <w:tcMar>
-              <w:top w:type="dxa" w:w="30"/>
-              <w:left w:type="dxa" w:w="60"/>
-              <w:bottom w:type="dxa" w:w="30"/>
-              <w:right w:type="dxa" w:w="60"/>
-            </w:tcMar>
-            <w:vAlign w:val="center"/>
-          </w:tcPr>
-          <w:p>
-            <w:pPr>
-              <w:spacing w:after="0" w:line="250"/>
-              <w:jc w:val="left"/>
-            </w:pPr>
-            <w:r>
-              <w:rPr>
-                <w:rFonts w:ascii="Times New Roman" w:cs="Times New Roman" w:eastAsia="Times New Roman" w:hAnsi="Times New Roman"/>
-                <w:sz w:val="22"/>
-                <w:szCs w:val="22"/>
-              </w:rPr>
-              <w:t xml:space="preserve">Xác định nhóm độ phức tạp N1–N5; đề xuất, phê duyệt sản phẩm chuẩn và hệ số quy đổi (Phụ lục II, III).</w:t>
+              <w:t xml:space="preserve">Phân nhóm N1–N5, xác định hệ số quy đổi</w:t>
+            </w:r>
+          </w:p>
+        </w:tc>
+        <w:tc>
+          <w:tcPr>
+            <w:tcMar>
+              <w:top w:type="dxa" w:w="30"/>
+              <w:left w:type="dxa" w:w="60"/>
+              <w:bottom w:type="dxa" w:w="30"/>
+              <w:right w:type="dxa" w:w="60"/>
+            </w:tcMar>
+            <w:vAlign w:val="center"/>
+          </w:tcPr>
+          <w:p>
+            <w:pPr>
+              <w:spacing w:after="0" w:line="250"/>
+              <w:jc w:val="left"/>
+            </w:pPr>
+            <w:r>
+              <w:rPr>
+                <w:rFonts w:ascii="Times New Roman" w:cs="Times New Roman" w:eastAsia="Times New Roman" w:hAnsi="Times New Roman"/>
+                <w:sz w:val="22"/>
+                <w:szCs w:val="22"/>
+              </w:rPr>
+              <w:t xml:space="preserve">Xác định nhóm độ phức tạp N1–N5; đề xuất, phê duyệt sản phẩm chuẩn và điểm/hệ số quy đổi theo độ phức tạp so với sản phẩm chuẩn (Phụ lục II, III).</w:t>
             </w:r>
           </w:p>
         </w:tc>
@@ -1434,7 +1409,7 @@
           <w:sz w:val="26"/>
           <w:szCs w:val="26"/>
         </w:rPr>
-        <w:t xml:space="preserve">Danh mục Nhóm II được dựng theo ba phần:</w:t>
+        <w:t xml:space="preserve">Danh mục sản phẩm/công việc (dùng để chấm Nhóm II — 70 điểm) được dựng theo ba phần. Lưu ý: "Phần I/II/III" dưới đây là cách chia danh mục, khác với "Nhóm I (30 điểm) / Nhóm II (70 điểm)" của thang điểm — cả ba phần đều thuộc Nhóm II:</w:t>
       </w:r>
     </w:p>
     <w:p>
@@ -1459,7 +1434,7 @@
           <w:sz w:val="26"/>
           <w:szCs w:val="26"/>
         </w:rPr>
-        <w:t xml:space="preserve">I. Chuyên môn, nghiệp vụ (CMNV): </w:t>
+        <w:t xml:space="preserve">Phần I – Chuyên môn, nghiệp vụ (CMNV): </w:t>
       </w:r>
       <w:r>
         <w:rPr>
@@ -1492,7 +1467,7 @@
           <w:sz w:val="26"/>
           <w:szCs w:val="26"/>
         </w:rPr>
-        <w:t xml:space="preserve">II. Lãnh đạo, quản lý (LĐQL): </w:t>
+        <w:t xml:space="preserve">Phần II – Lãnh đạo, quản lý (LĐQL): </w:t>
       </w:r>
       <w:r>
         <w:rPr>
@@ -1525,7 +1500,7 @@
           <w:sz w:val="26"/>
           <w:szCs w:val="26"/>
         </w:rPr>
-        <w:t xml:space="preserve">III. Hỗ trợ, phục vụ (HTPV): </w:t>
+        <w:t xml:space="preserve">Phần III – Hỗ trợ, phục vụ (HTPV): </w:t>
       </w:r>
       <w:r>
         <w:rPr>
@@ -1566,7 +1541,7 @@
           <w:sz w:val="26"/>
           <w:szCs w:val="26"/>
         </w:rPr>
-        <w:t xml:space="preserve">Mỗi cán bộ được xác định Mẫu đối tượng theo chức vụ; mỗi Mẫu chỉ áp dụng nhóm danh mục phù hợp:</w:t>
+        <w:t xml:space="preserve">Mỗi cán bộ được xác định Mẫu đối tượng theo chức vụ; mỗi Mẫu chỉ áp dụng phần danh mục phù hợp:</w:t>
       </w:r>
     </w:p>
     <w:tbl>
@@ -1703,7 +1678,7 @@
                 <w:sz w:val="22"/>
                 <w:szCs w:val="22"/>
               </w:rPr>
-              <w:t xml:space="preserve">Nhóm danh mục áp dụng</w:t>
+              <w:t xml:space="preserve">Phần danh mục áp dụng</w:t>
             </w:r>
           </w:p>
         </w:tc>
@@ -1805,7 +1780,7 @@
                 <w:sz w:val="22"/>
                 <w:szCs w:val="22"/>
               </w:rPr>
-              <w:t xml:space="preserve">Nhóm II (SH.LD — lãnh đạo, quản lý)</w:t>
+              <w:t xml:space="preserve">Phần II (LĐQL — SH.LD)</w:t>
             </w:r>
           </w:p>
         </w:tc>
@@ -1907,7 +1882,7 @@
                 <w:sz w:val="22"/>
                 <w:szCs w:val="22"/>
               </w:rPr>
-              <w:t xml:space="preserve">Nhóm I + II (SH.CM + SH.LD)</w:t>
+              <w:t xml:space="preserve">Phần I + II (CMNV + LĐQL — SH.CM + SH.LD)</w:t>
             </w:r>
           </w:p>
         </w:tc>
@@ -2009,7 +1984,7 @@
                 <w:sz w:val="22"/>
                 <w:szCs w:val="22"/>
               </w:rPr>
-              <w:t xml:space="preserve">Nhóm I (SH.CM — chuyên môn)</w:t>
+              <w:t xml:space="preserve">Phần I (CMNV — SH.CM)</w:t>
             </w:r>
           </w:p>
         </w:tc>
@@ -2111,7 +2086,7 @@
                 <w:sz w:val="22"/>
                 <w:szCs w:val="22"/>
               </w:rPr>
-              <w:t xml:space="preserve">Nhóm III (SH.HT — hỗ trợ, phục vụ)</w:t>
+              <w:t xml:space="preserve">Phần III (HTPV — SH.HT)</w:t>
             </w:r>
           </w:p>
         </w:tc>
@@ -2132,7 +2107,7 @@
           <w:sz w:val="26"/>
           <w:szCs w:val="26"/>
         </w:rPr>
-        <w:t xml:space="preserve">3. Phân nhóm độ phức tạp N1–N5 và hệ số quy đổi</w:t>
+        <w:t xml:space="preserve">3. Phân nhóm độ phức tạp N1–N5 và điểm quy đổi</w:t>
       </w:r>
     </w:p>
     <w:p>
@@ -2147,7 +2122,7 @@
           <w:sz w:val="26"/>
           <w:szCs w:val="26"/>
         </w:rPr>
-        <w:t xml:space="preserve">Mỗi mục được gắn nhóm độ phức tạp từ N1 (đơn giản, lặp lại) đến N5 (trọng yếu, tác động lớn). Bảng dưới đây đối chiếu thang giờ công theo Sổ tay của Bộ Nội vụ (sản phẩm chuẩn = 01 giờ = 10 điểm) với thang điểm quy đổi chuẩn hóa đang dùng trên phần mềm (sản phẩm chuẩn = 100 điểm = hệ số 1,0):</w:t>
+        <w:t xml:space="preserve">Mỗi mục được gắn nhóm độ phức tạp từ N1 (đơn giản, lặp lại) đến N5 (trọng yếu, tác động lớn). Hệ số quy đổi được xác định theo mức độ phức tạp, công sức so với sản phẩm chuẩn (chuẩn = 100 điểm = hệ số 1,0), do tổ chuyên gia/nhóm cán bộ am hiểu nghiệp vụ đề xuất — không quy về đơn vị giờ công:</w:t>
       </w:r>
     </w:p>
     <w:tbl>
@@ -2168,7 +2143,6 @@
         <w:gridCol w:w="100"/>
         <w:gridCol w:w="100"/>
         <w:gridCol w:w="100"/>
-        <w:gridCol w:w="100"/>
       </w:tblGrid>
       <w:tr>
         <w:trPr>
@@ -2176,7 +2150,7 @@
         </w:trPr>
         <w:tc>
           <w:tcPr>
-            <w:tcW w:type="pct" w:w="7%"/>
+            <w:tcW w:type="pct" w:w="8%"/>
             <w:shd w:fill="E8EEF7"/>
             <w:tcMar>
               <w:top w:type="dxa" w:w="30"/>
@@ -2234,7 +2208,7 @@
         </w:tc>
         <w:tc>
           <w:tcPr>
-            <w:tcW w:type="pct" w:w="14%"/>
+            <w:tcW w:type="pct" w:w="32%"/>
             <w:shd w:fill="E8EEF7"/>
             <w:tcMar>
               <w:top w:type="dxa" w:w="30"/>
@@ -2257,7 +2231,36 @@
                 <w:sz w:val="22"/>
                 <w:szCs w:val="22"/>
               </w:rPr>
-              <w:t xml:space="preserve">Giờ công tối đa (Sổ tay)</w:t>
+              <w:t xml:space="preserve">Ví dụ sản phẩm</w:t>
+            </w:r>
+          </w:p>
+        </w:tc>
+        <w:tc>
+          <w:tcPr>
+            <w:tcW w:type="pct" w:w="18%"/>
+            <w:shd w:fill="E8EEF7"/>
+            <w:tcMar>
+              <w:top w:type="dxa" w:w="30"/>
+              <w:left w:type="dxa" w:w="60"/>
+              <w:bottom w:type="dxa" w:w="30"/>
+              <w:right w:type="dxa" w:w="60"/>
+            </w:tcMar>
+            <w:vAlign w:val="center"/>
+          </w:tcPr>
+          <w:p>
+            <w:pPr>
+              <w:spacing w:after="0" w:line="250"/>
+              <w:jc w:val="center"/>
+            </w:pPr>
+            <w:r>
+              <w:rPr>
+                <w:rFonts w:ascii="Times New Roman" w:cs="Times New Roman" w:eastAsia="Times New Roman" w:hAnsi="Times New Roman"/>
+                <w:b/>
+                <w:bCs/>
+                <w:sz w:val="22"/>
+                <w:szCs w:val="22"/>
+              </w:rPr>
+              <w:t xml:space="preserve">Điểm quy đổi (chuẩn 100)</w:t>
             </w:r>
           </w:p>
         </w:tc>
@@ -2286,65 +2289,7 @@
                 <w:sz w:val="22"/>
                 <w:szCs w:val="22"/>
               </w:rPr>
-              <w:t xml:space="preserve">Điểm tối đa (Sổ tay)</w:t>
-            </w:r>
-          </w:p>
-        </w:tc>
-        <w:tc>
-          <w:tcPr>
-            <w:tcW w:type="pct" w:w="22%"/>
-            <w:shd w:fill="E8EEF7"/>
-            <w:tcMar>
-              <w:top w:type="dxa" w:w="30"/>
-              <w:left w:type="dxa" w:w="60"/>
-              <w:bottom w:type="dxa" w:w="30"/>
-              <w:right w:type="dxa" w:w="60"/>
-            </w:tcMar>
-            <w:vAlign w:val="center"/>
-          </w:tcPr>
-          <w:p>
-            <w:pPr>
-              <w:spacing w:after="0" w:line="250"/>
-              <w:jc w:val="center"/>
-            </w:pPr>
-            <w:r>
-              <w:rPr>
-                <w:rFonts w:ascii="Times New Roman" w:cs="Times New Roman" w:eastAsia="Times New Roman" w:hAnsi="Times New Roman"/>
-                <w:b/>
-                <w:bCs/>
-                <w:sz w:val="22"/>
-                <w:szCs w:val="22"/>
-              </w:rPr>
-              <w:t xml:space="preserve">Điểm quy đổi trên phần mềm (chuẩn 100)</w:t>
-            </w:r>
-          </w:p>
-        </w:tc>
-        <w:tc>
-          <w:tcPr>
-            <w:tcW w:type="pct" w:w="15%"/>
-            <w:shd w:fill="E8EEF7"/>
-            <w:tcMar>
-              <w:top w:type="dxa" w:w="30"/>
-              <w:left w:type="dxa" w:w="60"/>
-              <w:bottom w:type="dxa" w:w="30"/>
-              <w:right w:type="dxa" w:w="60"/>
-            </w:tcMar>
-            <w:vAlign w:val="center"/>
-          </w:tcPr>
-          <w:p>
-            <w:pPr>
-              <w:spacing w:after="0" w:line="250"/>
-              <w:jc w:val="center"/>
-            </w:pPr>
-            <w:r>
-              <w:rPr>
-                <w:rFonts w:ascii="Times New Roman" w:cs="Times New Roman" w:eastAsia="Times New Roman" w:hAnsi="Times New Roman"/>
-                <w:b/>
-                <w:bCs/>
-                <w:sz w:val="22"/>
-                <w:szCs w:val="22"/>
-              </w:rPr>
-              <w:t xml:space="preserve">Hệ số phần mềm</w:t>
+              <w:t xml:space="preserve">Hệ số</w:t>
             </w:r>
           </w:p>
         </w:tc>
@@ -2413,40 +2358,15 @@
           <w:p>
             <w:pPr>
               <w:spacing w:after="0" w:line="250"/>
-              <w:jc w:val="center"/>
-            </w:pPr>
-            <w:r>
-              <w:rPr>
-                <w:rFonts w:ascii="Times New Roman" w:cs="Times New Roman" w:eastAsia="Times New Roman" w:hAnsi="Times New Roman"/>
-                <w:sz w:val="22"/>
-                <w:szCs w:val="22"/>
-              </w:rPr>
-              <w:t xml:space="preserve">20</w:t>
-            </w:r>
-          </w:p>
-        </w:tc>
-        <w:tc>
-          <w:tcPr>
-            <w:tcMar>
-              <w:top w:type="dxa" w:w="30"/>
-              <w:left w:type="dxa" w:w="60"/>
-              <w:bottom w:type="dxa" w:w="30"/>
-              <w:right w:type="dxa" w:w="60"/>
-            </w:tcMar>
-            <w:vAlign w:val="center"/>
-          </w:tcPr>
-          <w:p>
-            <w:pPr>
-              <w:spacing w:after="0" w:line="250"/>
-              <w:jc w:val="center"/>
-            </w:pPr>
-            <w:r>
-              <w:rPr>
-                <w:rFonts w:ascii="Times New Roman" w:cs="Times New Roman" w:eastAsia="Times New Roman" w:hAnsi="Times New Roman"/>
-                <w:sz w:val="22"/>
-                <w:szCs w:val="22"/>
-              </w:rPr>
-              <w:t xml:space="preserve">200</w:t>
+              <w:jc w:val="left"/>
+            </w:pPr>
+            <w:r>
+              <w:rPr>
+                <w:rFonts w:ascii="Times New Roman" w:cs="Times New Roman" w:eastAsia="Times New Roman" w:hAnsi="Times New Roman"/>
+                <w:sz w:val="22"/>
+                <w:szCs w:val="22"/>
+              </w:rPr>
+              <w:t xml:space="preserve">Văn bản hành chính, phát hành văn bản, lưu hồ sơ, hậu cần</w:t>
             </w:r>
           </w:p>
         </w:tc>
@@ -2565,90 +2485,65 @@
           <w:p>
             <w:pPr>
               <w:spacing w:after="0" w:line="250"/>
-              <w:jc w:val="center"/>
-            </w:pPr>
-            <w:r>
-              <w:rPr>
-                <w:rFonts w:ascii="Times New Roman" w:cs="Times New Roman" w:eastAsia="Times New Roman" w:hAnsi="Times New Roman"/>
-                <w:sz w:val="22"/>
-                <w:szCs w:val="22"/>
-              </w:rPr>
-              <w:t xml:space="preserve">40</w:t>
-            </w:r>
-          </w:p>
-        </w:tc>
-        <w:tc>
-          <w:tcPr>
-            <w:tcMar>
-              <w:top w:type="dxa" w:w="30"/>
-              <w:left w:type="dxa" w:w="60"/>
-              <w:bottom w:type="dxa" w:w="30"/>
-              <w:right w:type="dxa" w:w="60"/>
-            </w:tcMar>
-            <w:vAlign w:val="center"/>
-          </w:tcPr>
-          <w:p>
-            <w:pPr>
-              <w:spacing w:after="0" w:line="250"/>
-              <w:jc w:val="center"/>
-            </w:pPr>
-            <w:r>
-              <w:rPr>
-                <w:rFonts w:ascii="Times New Roman" w:cs="Times New Roman" w:eastAsia="Times New Roman" w:hAnsi="Times New Roman"/>
-                <w:sz w:val="22"/>
-                <w:szCs w:val="22"/>
-              </w:rPr>
-              <w:t xml:space="preserve">400</w:t>
-            </w:r>
-          </w:p>
-        </w:tc>
-        <w:tc>
-          <w:tcPr>
-            <w:tcMar>
-              <w:top w:type="dxa" w:w="30"/>
-              <w:left w:type="dxa" w:w="60"/>
-              <w:bottom w:type="dxa" w:w="30"/>
-              <w:right w:type="dxa" w:w="60"/>
-            </w:tcMar>
-            <w:vAlign w:val="center"/>
-          </w:tcPr>
-          <w:p>
-            <w:pPr>
-              <w:spacing w:after="0" w:line="250"/>
-              <w:jc w:val="center"/>
-            </w:pPr>
-            <w:r>
-              <w:rPr>
-                <w:rFonts w:ascii="Times New Roman" w:cs="Times New Roman" w:eastAsia="Times New Roman" w:hAnsi="Times New Roman"/>
-                <w:sz w:val="22"/>
-                <w:szCs w:val="22"/>
-              </w:rPr>
-              <w:t xml:space="preserve">110</w:t>
-            </w:r>
-          </w:p>
-        </w:tc>
-        <w:tc>
-          <w:tcPr>
-            <w:tcMar>
-              <w:top w:type="dxa" w:w="30"/>
-              <w:left w:type="dxa" w:w="60"/>
-              <w:bottom w:type="dxa" w:w="30"/>
-              <w:right w:type="dxa" w:w="60"/>
-            </w:tcMar>
-            <w:vAlign w:val="center"/>
-          </w:tcPr>
-          <w:p>
-            <w:pPr>
-              <w:spacing w:after="0" w:line="250"/>
-              <w:jc w:val="center"/>
-            </w:pPr>
-            <w:r>
-              <w:rPr>
-                <w:rFonts w:ascii="Times New Roman" w:cs="Times New Roman" w:eastAsia="Times New Roman" w:hAnsi="Times New Roman"/>
-                <w:sz w:val="22"/>
-                <w:szCs w:val="22"/>
-              </w:rPr>
-              <w:t xml:space="preserve">1,1</w:t>
+              <w:jc w:val="left"/>
+            </w:pPr>
+            <w:r>
+              <w:rPr>
+                <w:rFonts w:ascii="Times New Roman" w:cs="Times New Roman" w:eastAsia="Times New Roman" w:hAnsi="Times New Roman"/>
+                <w:sz w:val="22"/>
+                <w:szCs w:val="22"/>
+              </w:rPr>
+              <w:t xml:space="preserve">Kế hoạch tháng/quý, biên bản, tiếp công dân, quản trị CNTT</w:t>
+            </w:r>
+          </w:p>
+        </w:tc>
+        <w:tc>
+          <w:tcPr>
+            <w:tcMar>
+              <w:top w:type="dxa" w:w="30"/>
+              <w:left w:type="dxa" w:w="60"/>
+              <w:bottom w:type="dxa" w:w="30"/>
+              <w:right w:type="dxa" w:w="60"/>
+            </w:tcMar>
+            <w:vAlign w:val="center"/>
+          </w:tcPr>
+          <w:p>
+            <w:pPr>
+              <w:spacing w:after="0" w:line="250"/>
+              <w:jc w:val="center"/>
+            </w:pPr>
+            <w:r>
+              <w:rPr>
+                <w:rFonts w:ascii="Times New Roman" w:cs="Times New Roman" w:eastAsia="Times New Roman" w:hAnsi="Times New Roman"/>
+                <w:sz w:val="22"/>
+                <w:szCs w:val="22"/>
+              </w:rPr>
+              <w:t xml:space="preserve">110 – 120</w:t>
+            </w:r>
+          </w:p>
+        </w:tc>
+        <w:tc>
+          <w:tcPr>
+            <w:tcMar>
+              <w:top w:type="dxa" w:w="30"/>
+              <w:left w:type="dxa" w:w="60"/>
+              <w:bottom w:type="dxa" w:w="30"/>
+              <w:right w:type="dxa" w:w="60"/>
+            </w:tcMar>
+            <w:vAlign w:val="center"/>
+          </w:tcPr>
+          <w:p>
+            <w:pPr>
+              <w:spacing w:after="0" w:line="250"/>
+              <w:jc w:val="center"/>
+            </w:pPr>
+            <w:r>
+              <w:rPr>
+                <w:rFonts w:ascii="Times New Roman" w:cs="Times New Roman" w:eastAsia="Times New Roman" w:hAnsi="Times New Roman"/>
+                <w:sz w:val="22"/>
+                <w:szCs w:val="22"/>
+              </w:rPr>
+              <w:t xml:space="preserve">1,1 – 1,2</w:t>
             </w:r>
           </w:p>
         </w:tc>
@@ -2717,40 +2612,15 @@
           <w:p>
             <w:pPr>
               <w:spacing w:after="0" w:line="250"/>
-              <w:jc w:val="center"/>
-            </w:pPr>
-            <w:r>
-              <w:rPr>
-                <w:rFonts w:ascii="Times New Roman" w:cs="Times New Roman" w:eastAsia="Times New Roman" w:hAnsi="Times New Roman"/>
-                <w:sz w:val="22"/>
-                <w:szCs w:val="22"/>
-              </w:rPr>
-              <w:t xml:space="preserve">60</w:t>
-            </w:r>
-          </w:p>
-        </w:tc>
-        <w:tc>
-          <w:tcPr>
-            <w:tcMar>
-              <w:top w:type="dxa" w:w="30"/>
-              <w:left w:type="dxa" w:w="60"/>
-              <w:bottom w:type="dxa" w:w="30"/>
-              <w:right w:type="dxa" w:w="60"/>
-            </w:tcMar>
-            <w:vAlign w:val="center"/>
-          </w:tcPr>
-          <w:p>
-            <w:pPr>
-              <w:spacing w:after="0" w:line="250"/>
-              <w:jc w:val="center"/>
-            </w:pPr>
-            <w:r>
-              <w:rPr>
-                <w:rFonts w:ascii="Times New Roman" w:cs="Times New Roman" w:eastAsia="Times New Roman" w:hAnsi="Times New Roman"/>
-                <w:sz w:val="22"/>
-                <w:szCs w:val="22"/>
-              </w:rPr>
-              <w:t xml:space="preserve">600</w:t>
+              <w:jc w:val="left"/>
+            </w:pPr>
+            <w:r>
+              <w:rPr>
+                <w:rFonts w:ascii="Times New Roman" w:cs="Times New Roman" w:eastAsia="Times New Roman" w:hAnsi="Times New Roman"/>
+                <w:sz w:val="22"/>
+                <w:szCs w:val="22"/>
+              </w:rPr>
+              <w:t xml:space="preserve">Thông báo kết luận, tham mưu tờ trình, báo cáo tài chính</w:t>
             </w:r>
           </w:p>
         </w:tc>
@@ -2852,57 +2722,32 @@
                 <w:sz w:val="22"/>
                 <w:szCs w:val="22"/>
               </w:rPr>
-              <w:t xml:space="preserve">Có tính mới, liên ngành, tham mưu chủ trương</w:t>
-            </w:r>
-          </w:p>
-        </w:tc>
-        <w:tc>
-          <w:tcPr>
-            <w:tcMar>
-              <w:top w:type="dxa" w:w="30"/>
-              <w:left w:type="dxa" w:w="60"/>
-              <w:bottom w:type="dxa" w:w="30"/>
-              <w:right w:type="dxa" w:w="60"/>
-            </w:tcMar>
-            <w:vAlign w:val="center"/>
-          </w:tcPr>
-          <w:p>
-            <w:pPr>
-              <w:spacing w:after="0" w:line="250"/>
-              <w:jc w:val="center"/>
-            </w:pPr>
-            <w:r>
-              <w:rPr>
-                <w:rFonts w:ascii="Times New Roman" w:cs="Times New Roman" w:eastAsia="Times New Roman" w:hAnsi="Times New Roman"/>
-                <w:sz w:val="22"/>
-                <w:szCs w:val="22"/>
-              </w:rPr>
-              <w:t xml:space="preserve">80</w:t>
-            </w:r>
-          </w:p>
-        </w:tc>
-        <w:tc>
-          <w:tcPr>
-            <w:tcMar>
-              <w:top w:type="dxa" w:w="30"/>
-              <w:left w:type="dxa" w:w="60"/>
-              <w:bottom w:type="dxa" w:w="30"/>
-              <w:right w:type="dxa" w:w="60"/>
-            </w:tcMar>
-            <w:vAlign w:val="center"/>
-          </w:tcPr>
-          <w:p>
-            <w:pPr>
-              <w:spacing w:after="0" w:line="250"/>
-              <w:jc w:val="center"/>
-            </w:pPr>
-            <w:r>
-              <w:rPr>
-                <w:rFonts w:ascii="Times New Roman" w:cs="Times New Roman" w:eastAsia="Times New Roman" w:hAnsi="Times New Roman"/>
-                <w:sz w:val="22"/>
-                <w:szCs w:val="22"/>
-              </w:rPr>
-              <w:t xml:space="preserve">800</w:t>
+              <w:t xml:space="preserve">Có tính mới, tổng hợp cao, tác động rộng</w:t>
+            </w:r>
+          </w:p>
+        </w:tc>
+        <w:tc>
+          <w:tcPr>
+            <w:tcMar>
+              <w:top w:type="dxa" w:w="30"/>
+              <w:left w:type="dxa" w:w="60"/>
+              <w:bottom w:type="dxa" w:w="30"/>
+              <w:right w:type="dxa" w:w="60"/>
+            </w:tcMar>
+            <w:vAlign w:val="center"/>
+          </w:tcPr>
+          <w:p>
+            <w:pPr>
+              <w:spacing w:after="0" w:line="250"/>
+              <w:jc w:val="left"/>
+            </w:pPr>
+            <w:r>
+              <w:rPr>
+                <w:rFonts w:ascii="Times New Roman" w:cs="Times New Roman" w:eastAsia="Times New Roman" w:hAnsi="Times New Roman"/>
+                <w:sz w:val="22"/>
+                <w:szCs w:val="22"/>
+              </w:rPr>
+              <w:t xml:space="preserve">Báo cáo công tác, tổng hợp thảo luận, tham mưu phiên họp</w:t>
             </w:r>
           </w:p>
         </w:tc>
@@ -3004,57 +2849,32 @@
                 <w:sz w:val="22"/>
                 <w:szCs w:val="22"/>
               </w:rPr>
-              <w:t xml:space="preserve">Hoạch định chiến lược, bao trùm, tác động lớn</w:t>
-            </w:r>
-          </w:p>
-        </w:tc>
-        <w:tc>
-          <w:tcPr>
-            <w:tcMar>
-              <w:top w:type="dxa" w:w="30"/>
-              <w:left w:type="dxa" w:w="60"/>
-              <w:bottom w:type="dxa" w:w="30"/>
-              <w:right w:type="dxa" w:w="60"/>
-            </w:tcMar>
-            <w:vAlign w:val="center"/>
-          </w:tcPr>
-          <w:p>
-            <w:pPr>
-              <w:spacing w:after="0" w:line="250"/>
-              <w:jc w:val="center"/>
-            </w:pPr>
-            <w:r>
-              <w:rPr>
-                <w:rFonts w:ascii="Times New Roman" w:cs="Times New Roman" w:eastAsia="Times New Roman" w:hAnsi="Times New Roman"/>
-                <w:sz w:val="22"/>
-                <w:szCs w:val="22"/>
-              </w:rPr>
-              <w:t xml:space="preserve">100</w:t>
-            </w:r>
-          </w:p>
-        </w:tc>
-        <w:tc>
-          <w:tcPr>
-            <w:tcMar>
-              <w:top w:type="dxa" w:w="30"/>
-              <w:left w:type="dxa" w:w="60"/>
-              <w:bottom w:type="dxa" w:w="30"/>
-              <w:right w:type="dxa" w:w="60"/>
-            </w:tcMar>
-            <w:vAlign w:val="center"/>
-          </w:tcPr>
-          <w:p>
-            <w:pPr>
-              <w:spacing w:after="0" w:line="250"/>
-              <w:jc w:val="center"/>
-            </w:pPr>
-            <w:r>
-              <w:rPr>
-                <w:rFonts w:ascii="Times New Roman" w:cs="Times New Roman" w:eastAsia="Times New Roman" w:hAnsi="Times New Roman"/>
-                <w:sz w:val="22"/>
-                <w:szCs w:val="22"/>
-              </w:rPr>
-              <w:t xml:space="preserve">1.000</w:t>
+              <w:t xml:space="preserve">Trọng yếu, phạm vi rộng, yêu cầu cao</w:t>
+            </w:r>
+          </w:p>
+        </w:tc>
+        <w:tc>
+          <w:tcPr>
+            <w:tcMar>
+              <w:top w:type="dxa" w:w="30"/>
+              <w:left w:type="dxa" w:w="60"/>
+              <w:bottom w:type="dxa" w:w="30"/>
+              <w:right w:type="dxa" w:w="60"/>
+            </w:tcMar>
+            <w:vAlign w:val="center"/>
+          </w:tcPr>
+          <w:p>
+            <w:pPr>
+              <w:spacing w:after="0" w:line="250"/>
+              <w:jc w:val="left"/>
+            </w:pPr>
+            <w:r>
+              <w:rPr>
+                <w:rFonts w:ascii="Times New Roman" w:cs="Times New Roman" w:eastAsia="Times New Roman" w:hAnsi="Times New Roman"/>
+                <w:sz w:val="22"/>
+                <w:szCs w:val="22"/>
+              </w:rPr>
+              <w:t xml:space="preserve">Chương trình công tác năm, dự thảo nghị quyết, báo cáo giám sát chuyên đề</w:t>
             </w:r>
           </w:p>
         </w:tc>
@@ -3124,7 +2944,7 @@
           <w:sz w:val="26"/>
           <w:szCs w:val="26"/>
         </w:rPr>
-        <w:t xml:space="preserve">Lưu ý khi chọn thang điểm: </w:t>
+        <w:t xml:space="preserve">Lưu ý: </w:t>
       </w:r>
       <w:r>
         <w:rPr>
@@ -3132,7 +2952,7 @@
           <w:sz w:val="26"/>
           <w:szCs w:val="26"/>
         </w:rPr>
-        <w:t xml:space="preserve">Thang giờ công (Sổ tay) trải rộng N1–N5 gấp 5 lần (20→100 giờ, hệ số tới 10), phản ánh đúng chênh lệch công sức. Thang điểm quy đổi trên phần mềm được nén về quanh sản phẩm chuẩn = 100 (hệ số ~0,8–2,0) để trọng số cân đối, tránh một vài nhiệm vụ N5 lấn át toàn bộ KPI. Cơ quan có thể chọn MỘT trong hai thang, miễn bảo đảm tương quan hợp lý giữa các nhóm và có khả năng giải trình; khi đổi thang, chỉ cần cập nhật lại cột điểm/hệ số quy đổi của từng mục cho khớp (giá trị tương đối giữa các nhóm giữ nguyên).</w:t>
+        <w:t xml:space="preserve">Điểm quy đổi (chuẩn = 100) làm TRỌNG SỐ khi tổng hợp KPI, nhân thêm hệ số Tầm quan trọng của nhiệm vụ trong kỳ. Cách chấm của phần mềm hoàn toàn dựa trên điểm quy đổi và tỷ lệ hoàn thành thực tế theo ba tiêu chí Số lượng, Chất lượng, Tiến độ — KHÔNG dùng đơn vị giờ công. Khi phát sinh nhiệm vụ mới, đơn vị đối chiếu với mục tương đương trong danh mục để gán nhóm N1–N5 và điểm quy đổi cho phù hợp, bảo đảm tương quan hợp lý và có khả năng giải trình.</w:t>
       </w:r>
     </w:p>
     <w:p>
@@ -3165,7 +2985,7 @@
           <w:sz w:val="26"/>
           <w:szCs w:val="26"/>
         </w:rPr>
-        <w:t xml:space="preserve">Sản phẩm chuẩn được chọn là "Soạn thảo 01 văn bản hành chính thông thường theo mẫu có sẵn" (mã SH.CM.A5) — nhóm N1, hệ số 1,0. Danh mục đầy đủ 48 mục kèm tại Phụ lục IV; hệ số = điểm quy đổi ÷ 100.</w:t>
+        <w:t xml:space="preserve">Sản phẩm chuẩn được chọn là "Soạn thảo 01 văn bản hành chính thông thường theo mẫu có sẵn" (mã SH.CM.A5) — nhóm N1, 100 điểm, hệ số 1,0. Danh mục đầy đủ 48 mục kèm tại Phụ lục IV; hệ số = điểm quy đổi ÷ 100.</w:t>
       </w:r>
     </w:p>
     <w:p>
@@ -3243,7 +3063,7 @@
           <w:sz w:val="26"/>
           <w:szCs w:val="26"/>
         </w:rPr>
-        <w:t xml:space="preserve">phẩm chất chính trị, đạo đức, lối sống, ý thức tổ chức kỷ luật, tác phong, năng lực lãnh đạo/chuyên môn… chấm theo Mẫu.</w:t>
+        <w:t xml:space="preserve">chấm theo Mẫu (bộ tiêu chí QĐ 1053-QĐ/TU của Tỉnh ủy) gồm: (1) chính trị, tư tưởng; (2) phẩm chất đạo đức và ý thức tổ chức kỷ luật; (3) năng lực chuyên môn/lãnh đạo, khả năng thực thi, tác phong, đổi mới sáng tạo, cải cách hành chính, chuyển đổi số; (4) uy tín, quy tụ đoàn kết; (5) tự phê bình và phê bình, tự soi, tự sửa.</w:t>
       </w:r>
     </w:p>
     <w:p>
@@ -4362,7 +4182,7 @@
                 <w:sz w:val="22"/>
                 <w:szCs w:val="22"/>
               </w:rPr>
-              <w:t xml:space="preserve">70 – 89 điểm + không có nhiệm vụ ở mức "Không hoàn thành".</w:t>
+              <w:t xml:space="preserve">70 – 89 điểm và không có nhiệm vụ ở mức "Không hoàn thành"; hoặc đạt ≥ 90 điểm nhưng chưa đủ điều kiện Hoàn thành xuất sắc.</w:t>
             </w:r>
           </w:p>
         </w:tc>
@@ -4416,7 +4236,7 @@
                 <w:sz w:val="22"/>
                 <w:szCs w:val="22"/>
               </w:rPr>
-              <w:t xml:space="preserve">50 – 69 điểm; hoặc có nhiệm vụ chưa đạt mức "Hoàn thành tốt".</w:t>
+              <w:t xml:space="preserve">50 – 69 điểm; hoặc đạt 70 – 89 điểm nhưng có nhiệm vụ ở mức "Không hoàn thành" (bị hạ từ Hoàn thành tốt).</w:t>
             </w:r>
           </w:p>
         </w:tc>
@@ -5494,7 +5314,7 @@
           <w:sz w:val="26"/>
           <w:szCs w:val="26"/>
         </w:rPr>
-        <w:t xml:space="preserve">KPI = (100×1,00 + 85×4,00 + 88,9×2,55) ÷ (1,00 + 4,00 + 2,55) = 666,7 ÷ 7,55 = 88,3%. Điểm Nhóm II = 88,3% × 70% = 61,8/70. Giả sử Nhóm I = 28/30 → Tổng = 89,8 điểm.</w:t>
+        <w:t xml:space="preserve">KPI = (100×1,00 + 85×4,00 + 88,9×2,55) ÷ (1,00 + 4,00 + 2,55) = 666,7 ÷ 7,55 = 88,3%. Điểm Nhóm II = 88,3% × 70% = 61,8/70. Giả sử Nhóm I = 29/30 → Tổng = 90,8 điểm.</w:t>
       </w:r>
     </w:p>
     <w:p>
@@ -5509,7 +5329,7 @@
           <w:sz w:val="26"/>
           <w:szCs w:val="26"/>
         </w:rPr>
-        <w:t xml:space="preserve">Xếp loại: tuy đạt gần 90 điểm nhưng không có nhiệm vụ nào "vượt mức" (tỷ lệ vượt mức 0% &lt; 30%) nên xếp </w:t>
+        <w:t xml:space="preserve">Xếp loại: đạt 90,8 điểm (≥ 90) nhưng chỉ 1/3 số nhiệm vụ đạt mức "Hoàn thành tốt" trở lên (điều kiện xuất sắc cần 100%) và không có nhiệm vụ nào "vượt mức" (cần ≥ 30%) nên theo Điều 8 xếp </w:t>
       </w:r>
       <w:r>
         <w:rPr>
@@ -5527,7 +5347,7 @@
           <w:sz w:val="26"/>
           <w:szCs w:val="26"/>
         </w:rPr>
-        <w:t xml:space="preserve"> (Điều 8).</w:t>
+        <w:t xml:space="preserve">.</w:t>
       </w:r>
     </w:p>
     <w:p>
@@ -7096,7 +6916,6 @@
     <w:p>
       <w:pPr>
         <w:spacing w:after="100" w:line="300"/>
-        <w:ind w:firstLine="0"/>
         <w:jc w:val="both"/>
       </w:pPr>
       <w:r>
@@ -7225,6 +7044,35 @@
         </w:tc>
         <w:tc>
           <w:tcPr>
+            <w:tcW w:type="pct" w:w="16%"/>
+            <w:shd w:fill="E8EEF7"/>
+            <w:tcMar>
+              <w:top w:type="dxa" w:w="30"/>
+              <w:left w:type="dxa" w:w="60"/>
+              <w:bottom w:type="dxa" w:w="30"/>
+              <w:right w:type="dxa" w:w="60"/>
+            </w:tcMar>
+            <w:vAlign w:val="center"/>
+          </w:tcPr>
+          <w:p>
+            <w:pPr>
+              <w:spacing w:after="0" w:line="250"/>
+              <w:jc w:val="center"/>
+            </w:pPr>
+            <w:r>
+              <w:rPr>
+                <w:rFonts w:ascii="Times New Roman" w:cs="Times New Roman" w:eastAsia="Times New Roman" w:hAnsi="Times New Roman"/>
+                <w:b/>
+                <w:bCs/>
+                <w:sz w:val="22"/>
+                <w:szCs w:val="22"/>
+              </w:rPr>
+              <w:t xml:space="preserve">Họ tên chuyên gia</w:t>
+            </w:r>
+          </w:p>
+        </w:tc>
+        <w:tc>
+          <w:tcPr>
             <w:tcW w:type="pct" w:w="15%"/>
             <w:shd w:fill="E8EEF7"/>
             <w:tcMar>
@@ -7248,13 +7096,13 @@
                 <w:sz w:val="22"/>
                 <w:szCs w:val="22"/>
               </w:rPr>
-              <w:t xml:space="preserve">Họ tên chuyên gia</w:t>
-            </w:r>
-          </w:p>
-        </w:tc>
-        <w:tc>
-          <w:tcPr>
-            <w:tcW w:type="pct" w:w="15%"/>
+              <w:t xml:space="preserve">Nhiệm vụ</w:t>
+            </w:r>
+          </w:p>
+        </w:tc>
+        <w:tc>
+          <w:tcPr>
+            <w:tcW w:type="pct" w:w="17%"/>
             <w:shd w:fill="E8EEF7"/>
             <w:tcMar>
               <w:top w:type="dxa" w:w="30"/>
@@ -7277,13 +7125,13 @@
                 <w:sz w:val="22"/>
                 <w:szCs w:val="22"/>
               </w:rPr>
-              <w:t xml:space="preserve">Nhiệm vụ</w:t>
-            </w:r>
-          </w:p>
-        </w:tc>
-        <w:tc>
-          <w:tcPr>
-            <w:tcW w:type="pct" w:w="16%"/>
+              <w:t xml:space="preserve">Sản phẩm đầu ra</w:t>
+            </w:r>
+          </w:p>
+        </w:tc>
+        <w:tc>
+          <w:tcPr>
+            <w:tcW w:type="pct" w:w="9%"/>
             <w:shd w:fill="E8EEF7"/>
             <w:tcMar>
               <w:top w:type="dxa" w:w="30"/>
@@ -7306,13 +7154,13 @@
                 <w:sz w:val="22"/>
                 <w:szCs w:val="22"/>
               </w:rPr>
-              <w:t xml:space="preserve">Sản phẩm đầu ra</w:t>
-            </w:r>
-          </w:p>
-        </w:tc>
-        <w:tc>
-          <w:tcPr>
-            <w:tcW w:type="pct" w:w="9%"/>
+              <w:t xml:space="preserve">Thuộc nhóm</w:t>
+            </w:r>
+          </w:p>
+        </w:tc>
+        <w:tc>
+          <w:tcPr>
+            <w:tcW w:type="pct" w:w="13%"/>
             <w:shd w:fill="E8EEF7"/>
             <w:tcMar>
               <w:top w:type="dxa" w:w="30"/>
@@ -7335,36 +7183,7 @@
                 <w:sz w:val="22"/>
                 <w:szCs w:val="22"/>
               </w:rPr>
-              <w:t xml:space="preserve">Thuộc nhóm</w:t>
-            </w:r>
-          </w:p>
-        </w:tc>
-        <w:tc>
-          <w:tcPr>
-            <w:tcW w:type="pct" w:w="15%"/>
-            <w:shd w:fill="E8EEF7"/>
-            <w:tcMar>
-              <w:top w:type="dxa" w:w="30"/>
-              <w:left w:type="dxa" w:w="60"/>
-              <w:bottom w:type="dxa" w:w="30"/>
-              <w:right w:type="dxa" w:w="60"/>
-            </w:tcMar>
-            <w:vAlign w:val="center"/>
-          </w:tcPr>
-          <w:p>
-            <w:pPr>
-              <w:spacing w:after="0" w:line="250"/>
-              <w:jc w:val="center"/>
-            </w:pPr>
-            <w:r>
-              <w:rPr>
-                <w:rFonts w:ascii="Times New Roman" w:cs="Times New Roman" w:eastAsia="Times New Roman" w:hAnsi="Times New Roman"/>
-                <w:b/>
-                <w:bCs/>
-                <w:sz w:val="22"/>
-                <w:szCs w:val="22"/>
-              </w:rPr>
-              <w:t xml:space="preserve">Giờ công chuẩn/điểm đề xuất</w:t>
+              <w:t xml:space="preserve">Điểm quy đổi đề xuất</w:t>
             </w:r>
           </w:p>
         </w:tc>
@@ -8105,7 +7924,7 @@
         </w:tc>
         <w:tc>
           <w:tcPr>
-            <w:tcW w:type="pct" w:w="22%"/>
+            <w:tcW w:type="pct" w:w="24%"/>
             <w:shd w:fill="E8EEF7"/>
             <w:tcMar>
               <w:top w:type="dxa" w:w="30"/>
@@ -8186,7 +8005,7 @@
                 <w:sz w:val="22"/>
                 <w:szCs w:val="22"/>
               </w:rPr>
-              <w:t xml:space="preserve">Giờ công/điểm chuẩn</w:t>
+              <w:t xml:space="preserve">Điểm quy đổi chuẩn</w:t>
             </w:r>
           </w:p>
         </w:tc>
@@ -8221,7 +8040,7 @@
         </w:tc>
         <w:tc>
           <w:tcPr>
-            <w:tcW w:type="pct" w:w="26%"/>
+            <w:tcW w:type="pct" w:w="24%"/>
             <w:shd w:fill="E8EEF7"/>
             <w:tcMar>
               <w:top w:type="dxa" w:w="30"/>
@@ -8506,7 +8325,7 @@
                 <w:sz w:val="22"/>
                 <w:szCs w:val="22"/>
               </w:rPr>
-              <w:t xml:space="preserve">01 giờ / 100 điểm</w:t>
+              <w:t xml:space="preserve">100 điểm</w:t>
             </w:r>
           </w:p>
         </w:tc>
@@ -9977,7 +9796,7 @@
           <w:sz w:val="26"/>
           <w:szCs w:val="26"/>
         </w:rPr>
-        <w:t xml:space="preserve">Biểu theo mẫu Phụ lục III của Sổ tay Bộ Nội vụ; cột Điểm quy đổi/Hệ số phục vụ quản trị OKR/KPI. Khi áp dụng đồng thời chấm điểm và giờ công, điểm quy đổi phải tương quan hợp lý với nhóm công việc, mức độ khó, phạm vi phối hợp và thẩm quyền phê duyệt sản phẩm.</w:t>
+        <w:t xml:space="preserve">Biểu theo mẫu Phụ lục III của Sổ tay Bộ Nội vụ; điểm quy đổi/hệ số được xác định theo mức độ phức tạp so với sản phẩm chuẩn (chuẩn = 100 điểm), bảo đảm tương quan hợp lý giữa nhóm công việc, mức độ khó, phạm vi phối hợp và thẩm quyền phê duyệt sản phẩm.</w:t>
       </w:r>
     </w:p>
     <w:p>
@@ -19558,20 +19377,6 @@
                 <w:szCs w:val="22"/>
               </w:rPr>
               <w:t xml:space="preserve">(ký, đóng dấu)</w:t>
-            </w:r>
-          </w:p>
-          <w:p>
-            <w:pPr>
-              <w:spacing w:after="100" w:line="300"/>
-              <w:jc w:val="center"/>
-            </w:pPr>
-            <w:r>
-              <w:rPr>
-                <w:rFonts w:ascii="Times New Roman" w:cs="Times New Roman" w:eastAsia="Times New Roman" w:hAnsi="Times New Roman"/>
-                <w:sz w:val="26"/>
-                <w:szCs w:val="26"/>
-              </w:rPr>
-              <w:t xml:space="preserve"/>
             </w:r>
           </w:p>
         </w:tc>

</xml_diff>